<commit_message>
Rewrite resume voice: outcome-first marketing language, lightly technical
- Every bullet now leads with the business outcome; tools trail in parentheses
- EP bullets merged 6 -> 4; artifact metrics (dbt models/tests/layers) moved out
  of prose into stat tiles, Projects tab and ATS keyword tails
- Add plain-language tagline under the Data Engineer title (EN/TH)
- Team figure corrected 25 -> 30 people; time saved 25-75 -> 30-90 hrs/day
- Marketing-first meta/og descriptions
- Add index.html redirect so the bare /portfolio/ URL no longer 404s
- Regenerate PDFs + docx; one-pager still exactly 1 A4 page

Co-Authored-By: Claude Fable 5 <noreply@anthropic.com>
</commit_message>
<xml_diff>
--- a/cv-sahatsawat-thongma.docx
+++ b/cv-sahatsawat-thongma.docx
@@ -18,7 +18,7 @@
     </w:p>
     <w:p>
       <w:pPr>
-        <w:spacing w:after="80" w:before="0"/>
+        <w:spacing w:after="20" w:before="0"/>
       </w:pPr>
       <w:r>
         <w:rPr>
@@ -28,6 +28,20 @@
           <w:sz w:val="25"/>
         </w:rPr>
         <w:t>Data Engineer</w:t>
+      </w:r>
+    </w:p>
+    <w:p>
+      <w:pPr>
+        <w:spacing w:after="80" w:before="0"/>
+      </w:pPr>
+      <w:r>
+        <w:rPr>
+          <w:rFonts w:ascii="Tahoma" w:hAnsi="Tahoma" w:cs="Tahoma"/>
+          <w:b w:val="0"/>
+          <w:color w:val="555555"/>
+          <w:sz w:val="20"/>
+        </w:rPr>
+        <w:t>สร้างระบบข้อมูลให้ธุรกิจ e-commerce — คนเดียว ตั้งแต่ต้นจนจบ</w:t>
       </w:r>
     </w:p>
     <w:p>
@@ -86,7 +100,7 @@
           <w:b w:val="0"/>
           <w:color w:val="1A1A1A"/>
         </w:rPr>
-        <w:t>Data Engineer ประสบการณ์ 4 ปีในสาย e-commerce — ออกแบบ สร้าง และดูแล data platform เต็มระบบในตัวคนเดียว (end-to-end) ให้บริษัท e-commerce ระดับร้อยล้านบาทต่อเดือน ปัจจุบันดูแล PostgreSQL data warehouse ขนาด 59 GB ที่ ingest 100K+ records/วัน ผ่าน ELT pipelines ด้วย 178 dbt models ใต้ 420 data tests บน medallion architecture 5 ชั้น + dimensional (Kimball) modeling orchestrate ด้วย Apache Airflow ใน Docker ปี 2026 ปิด migration ใหญ่ 2 ตัวจบในไตรมาสเดียว (Azure SQL Server → PostgreSQL on-prem และ Azure Data Factory → Airflow) ปัจจุบันโฟกัสที่ data reliability — จับเคสที่ pipeline เขียวแต่ข้อมูลหายเงียบ ๆ งานที่สร้างช่วยให้ทีม 25 คนประหยัดเวลารวม 25–75 ชม./วัน</w:t>
+        <w:t>Data Engineer ประสบการณ์ 4 ปีในสาย e-commerce — ออกแบบ สร้าง และดูแล data platform เต็มระบบคนเดียว (end-to-end) ให้บริษัท e-commerce ระดับร้อยล้านบาทต่อเดือน งานที่สร้างช่วยให้ทีม 30+ คนประหยัดเวลารวม 30–90 ชม./วัน งานมือ ~40 งาน/วันเปลี่ยนเป็นระบบอัตโนมัติที่รันเองตั้งแต่ตีห้า และผู้บริหารดูยอดขายได้เองโดยไม่ต้องรอรายงาน เทคโนโลยีที่ใช้จริงใน production: PostgreSQL data warehouse 59 GB (ingest 100K+ records/วัน), dbt, Apache Airflow ใน Docker, Python, ELT pipelines, medallion + dimensional (Kimball) modeling, Azure ปี 2026 ปิด platform migration 2 ตัวในไตรมาสเดียว (Azure SQL Server → PostgreSQL on-prem, Azure Data Factory → Airflow) ปัจจุบันโฟกัส data reliability — จับเคสที่ pipeline ขึ้นว่าสำเร็จแต่ข้อมูลหายเงียบ ๆ ก่อนกระทบการตัดสินใจ</w:t>
       </w:r>
     </w:p>
     <w:p>
@@ -326,7 +340,7 @@
           <w:b/>
           <w:color w:val="1A1A1A"/>
         </w:rPr>
-        <w:t>data warehouse ตัวแรกของบริษัท</w:t>
+        <w:t>data warehouse ตัวแรกของบริษัท พร้อม platform รอบตัวมัน</w:t>
       </w:r>
       <w:r>
         <w:rPr>
@@ -334,7 +348,7 @@
           <w:b w:val="0"/>
           <w:color w:val="1A1A1A"/>
         </w:rPr>
-        <w:t xml:space="preserve"> — แทน Google Sheets/Excel ที่กระจัดกระจาย ให้ทีม 25+ คน ประหยัดเวลารวมทั้งทีม </w:t>
+        <w:t xml:space="preserve"> — แทน Google Sheets/Excel ให้ทีม 30+ คน ประหยัดเวลารวม </w:t>
       </w:r>
       <w:r>
         <w:rPr>
@@ -342,7 +356,7 @@
           <w:b/>
           <w:color w:val="1A1A1A"/>
         </w:rPr>
-        <w:t>25–75 ชั่วโมง/วัน</w:t>
+        <w:t>30–90 ชม./วัน</w:t>
       </w:r>
       <w:r>
         <w:rPr>
@@ -350,149 +364,7 @@
           <w:b w:val="0"/>
           <w:color w:val="1A1A1A"/>
         </w:rPr>
-        <w:t xml:space="preserve"> และจบปัญหา reconcile ตัวเลขข้าม spreadsheet</w:t>
-      </w:r>
-    </w:p>
-    <w:p>
-      <w:pPr>
-        <w:pStyle w:val="ListBullet"/>
-        <w:spacing w:after="60" w:line="269" w:lineRule="auto"/>
-      </w:pPr>
-      <w:r>
-        <w:rPr>
-          <w:rFonts w:ascii="Tahoma" w:hAnsi="Tahoma" w:cs="Tahoma"/>
-          <w:b w:val="0"/>
-          <w:color w:val="1A1A1A"/>
-        </w:rPr>
-        <w:t xml:space="preserve">ออกแบบและสร้าง </w:t>
-      </w:r>
-      <w:r>
-        <w:rPr>
-          <w:rFonts w:ascii="Tahoma" w:hAnsi="Tahoma" w:cs="Tahoma"/>
-          <w:b/>
-          <w:color w:val="1A1A1A"/>
-        </w:rPr>
-        <w:t>platform ทั้งระบบ</w:t>
-      </w:r>
-      <w:r>
-        <w:rPr>
-          <w:rFonts w:ascii="Tahoma" w:hAnsi="Tahoma" w:cs="Tahoma"/>
-          <w:b w:val="0"/>
-          <w:color w:val="1A1A1A"/>
-        </w:rPr>
-        <w:t xml:space="preserve"> — </w:t>
-      </w:r>
-      <w:r>
-        <w:rPr>
-          <w:rFonts w:ascii="Tahoma" w:hAnsi="Tahoma" w:cs="Tahoma"/>
-          <w:b/>
-          <w:color w:val="1A1A1A"/>
-        </w:rPr>
-        <w:t>178 dbt models</w:t>
-      </w:r>
-      <w:r>
-        <w:rPr>
-          <w:rFonts w:ascii="Tahoma" w:hAnsi="Tahoma" w:cs="Tahoma"/>
-          <w:b w:val="0"/>
-          <w:color w:val="1A1A1A"/>
-        </w:rPr>
-        <w:t xml:space="preserve"> บน medallion architecture 5 ชั้น (bronze → staging → silver → intermediate → gold) พร้อม </w:t>
-      </w:r>
-      <w:r>
-        <w:rPr>
-          <w:rFonts w:ascii="Tahoma" w:hAnsi="Tahoma" w:cs="Tahoma"/>
-          <w:b/>
-          <w:color w:val="1A1A1A"/>
-        </w:rPr>
-        <w:t>420 data tests</w:t>
-      </w:r>
-      <w:r>
-        <w:rPr>
-          <w:rFonts w:ascii="Tahoma" w:hAnsi="Tahoma" w:cs="Tahoma"/>
-          <w:b w:val="0"/>
-          <w:color w:val="1A1A1A"/>
-        </w:rPr>
-        <w:t xml:space="preserve">, source-freshness checks และ </w:t>
-      </w:r>
-      <w:r>
-        <w:rPr>
-          <w:rFonts w:ascii="Tahoma" w:hAnsi="Tahoma" w:cs="Tahoma"/>
-          <w:b/>
-          <w:color w:val="1A1A1A"/>
-        </w:rPr>
-        <w:t>SCD type-2 dimensional modeling</w:t>
-      </w:r>
-      <w:r>
-        <w:rPr>
-          <w:rFonts w:ascii="Tahoma" w:hAnsi="Tahoma" w:cs="Tahoma"/>
-          <w:b w:val="0"/>
-          <w:color w:val="1A1A1A"/>
-        </w:rPr>
-        <w:t xml:space="preserve">; ป้อนด้วย </w:t>
-      </w:r>
-      <w:r>
-        <w:rPr>
-          <w:rFonts w:ascii="Tahoma" w:hAnsi="Tahoma" w:cs="Tahoma"/>
-          <w:b/>
-          <w:color w:val="1A1A1A"/>
-        </w:rPr>
-        <w:t>Python + Playwright ingestion framework</w:t>
-      </w:r>
-      <w:r>
-        <w:rPr>
-          <w:rFonts w:ascii="Tahoma" w:hAnsi="Tahoma" w:cs="Tahoma"/>
-          <w:b w:val="0"/>
-          <w:color w:val="1A1A1A"/>
-        </w:rPr>
-        <w:t xml:space="preserve"> ที่เขียนเองมาแทน Power Automate Desktop 40 flows เดิม orchestrate ทุกคืนด้วย </w:t>
-      </w:r>
-      <w:r>
-        <w:rPr>
-          <w:rFonts w:ascii="Tahoma" w:hAnsi="Tahoma" w:cs="Tahoma"/>
-          <w:b/>
-          <w:color w:val="1A1A1A"/>
-        </w:rPr>
-        <w:t>Apache Airflow ใน Docker</w:t>
-      </w:r>
-      <w:r>
-        <w:rPr>
-          <w:rFonts w:ascii="Tahoma" w:hAnsi="Tahoma" w:cs="Tahoma"/>
-          <w:b w:val="0"/>
-          <w:color w:val="1A1A1A"/>
-        </w:rPr>
-        <w:t xml:space="preserve">; ingest </w:t>
-      </w:r>
-      <w:r>
-        <w:rPr>
-          <w:rFonts w:ascii="Tahoma" w:hAnsi="Tahoma" w:cs="Tahoma"/>
-          <w:b/>
-          <w:color w:val="1A1A1A"/>
-        </w:rPr>
-        <w:t>100K+ records/วัน</w:t>
-      </w:r>
-      <w:r>
-        <w:rPr>
-          <w:rFonts w:ascii="Tahoma" w:hAnsi="Tahoma" w:cs="Tahoma"/>
-          <w:b w:val="0"/>
-          <w:color w:val="1A1A1A"/>
-        </w:rPr>
-        <w:t xml:space="preserve"> จาก 8 source systems แล้วเสิร์ฟ </w:t>
-      </w:r>
-      <w:r>
-        <w:rPr>
-          <w:rFonts w:ascii="Tahoma" w:hAnsi="Tahoma" w:cs="Tahoma"/>
-          <w:b/>
-          <w:color w:val="1A1A1A"/>
-        </w:rPr>
-        <w:t>FastAPI + React dashboards</w:t>
-      </w:r>
-      <w:r>
-        <w:rPr>
-          <w:rFonts w:ascii="Tahoma" w:hAnsi="Tahoma" w:cs="Tahoma"/>
-          <w:b w:val="0"/>
-          <w:color w:val="1A1A1A"/>
-        </w:rPr>
-        <w:t xml:space="preserve"> ให้ทีม exec, procurement, warehouse และ fulfillment พร้อมทาง self-service แบบ read-only ให้คนที่ไม่ใช่สาย tech ดึงเลขเองได้</w:t>
+        <w:t xml:space="preserve"> ผู้บริหารดูยอดขาย/สต็อกได้เอง งานมือ ~40 งาน/วันรันเองตั้งแต่ตีห้า · เทคนิค: 178 dbt models บน medallion architecture 5 ชั้น + SCD type-2 dimensional modeling, 420 data tests, ingest 100K+ records/วัน จาก 8 source systems ด้วย Python + Playwright ingestion framework, orchestrate ด้วย Apache Airflow ใน Docker, เสิร์ฟผ่าน FastAPI + React dashboards พร้อมทาง self-service แบบ read-only</w:t>
       </w:r>
     </w:p>
     <w:p>
@@ -506,7 +378,7 @@
           <w:b/>
           <w:color w:val="1A1A1A"/>
         </w:rPr>
-        <w:t>ปิด platform migration ใหญ่ 2 ตัวจบในไตรมาสเดียว</w:t>
+        <w:t>จับและแก้ data incident ที่ไม่มีสัญญาณเตือน</w:t>
       </w:r>
       <w:r>
         <w:rPr>
@@ -514,7 +386,7 @@
           <w:b w:val="0"/>
           <w:color w:val="1A1A1A"/>
         </w:rPr>
-        <w:t xml:space="preserve"> — ย้าย warehouse จาก </w:t>
+        <w:t xml:space="preserve"> — กู้เลขพัสดุคืน </w:t>
       </w:r>
       <w:r>
         <w:rPr>
@@ -522,7 +394,7 @@
           <w:b/>
           <w:color w:val="1A1A1A"/>
         </w:rPr>
-        <w:t>Azure SQL Server → self-hosted PostgreSQL</w:t>
+        <w:t>23,677 เลข</w:t>
       </w:r>
       <w:r>
         <w:rPr>
@@ -530,61 +402,7 @@
           <w:b w:val="0"/>
           <w:color w:val="1A1A1A"/>
         </w:rPr>
-        <w:t xml:space="preserve"> (dbt-sqlserver → dbt-postgres) และ</w:t>
-      </w:r>
-      <w:r>
-        <w:rPr>
-          <w:rFonts w:ascii="Tahoma" w:hAnsi="Tahoma" w:cs="Tahoma"/>
-          <w:b/>
-          <w:color w:val="1A1A1A"/>
-        </w:rPr>
-        <w:t>ปลดระวาง Azure Data Factory ทั้ง 46 pipelines ที่เคยสร้างเอง</w:t>
-      </w:r>
-      <w:r>
-        <w:rPr>
-          <w:rFonts w:ascii="Tahoma" w:hAnsi="Tahoma" w:cs="Tahoma"/>
-          <w:b w:val="0"/>
-          <w:color w:val="1A1A1A"/>
-        </w:rPr>
-        <w:t xml:space="preserve"> แทนด้วย Airflow DAGs ที่เขียนเอง ลด cloud cost โดย dashboard ไม่ดาวน์เลย</w:t>
-      </w:r>
-    </w:p>
-    <w:p>
-      <w:pPr>
-        <w:pStyle w:val="ListBullet"/>
-        <w:spacing w:after="60" w:line="269" w:lineRule="auto"/>
-      </w:pPr>
-      <w:r>
-        <w:rPr>
-          <w:rFonts w:ascii="Tahoma" w:hAnsi="Tahoma" w:cs="Tahoma"/>
-          <w:b/>
-          <w:color w:val="1A1A1A"/>
-        </w:rPr>
-        <w:t>Data reliability engineering</w:t>
-      </w:r>
-      <w:r>
-        <w:rPr>
-          <w:rFonts w:ascii="Tahoma" w:hAnsi="Tahoma" w:cs="Tahoma"/>
-          <w:b w:val="0"/>
-          <w:color w:val="1A1A1A"/>
-        </w:rPr>
-        <w:t xml:space="preserve"> — ไล่ปิดคลาสความพังแบบ "pipeline เขียวแต่ข้อมูลหาย": freshness canary ที่วัดเทียบ source สดแทนการเชื่อ exit code และ value-presence gate ที่บังคับเป็น hard failure; </w:t>
-      </w:r>
-      <w:r>
-        <w:rPr>
-          <w:rFonts w:ascii="Tahoma" w:hAnsi="Tahoma" w:cs="Tahoma"/>
-          <w:b/>
-          <w:color w:val="1A1A1A"/>
-        </w:rPr>
-        <w:t>กู้เลขพัสดุคืน 23,677 เลข</w:t>
-      </w:r>
-      <w:r>
-        <w:rPr>
-          <w:rFonts w:ascii="Tahoma" w:hAnsi="Tahoma" w:cs="Tahoma"/>
-          <w:b w:val="0"/>
-          <w:color w:val="1A1A1A"/>
-        </w:rPr>
-        <w:t xml:space="preserve"> ที่กฎ dedup ลบทิ้งไปเงียบ ๆ และแก้ที่รากจน </w:t>
+        <w:t xml:space="preserve"> ที่ dedup rule ลบทิ้งเงียบ ๆ และแก้ที่รากจน </w:t>
       </w:r>
       <w:r>
         <w:rPr>
@@ -600,53 +418,7 @@
           <w:b w:val="0"/>
           <w:color w:val="1A1A1A"/>
         </w:rPr>
-        <w:t xml:space="preserve"> พร้อม test กันไม่ให้กลับมาโดยไม่มีใครรู้</w:t>
-      </w:r>
-    </w:p>
-    <w:p>
-      <w:pPr>
-        <w:pStyle w:val="ListBullet"/>
-        <w:spacing w:after="60" w:line="269" w:lineRule="auto"/>
-      </w:pPr>
-      <w:r>
-        <w:rPr>
-          <w:rFonts w:ascii="Tahoma" w:hAnsi="Tahoma" w:cs="Tahoma"/>
-          <w:b w:val="0"/>
-          <w:color w:val="1A1A1A"/>
-        </w:rPr>
-        <w:t xml:space="preserve">ทำ </w:t>
-      </w:r>
-      <w:r>
-        <w:rPr>
-          <w:rFonts w:ascii="Tahoma" w:hAnsi="Tahoma" w:cs="Tahoma"/>
-          <w:b/>
-          <w:color w:val="1A1A1A"/>
-        </w:rPr>
-        <w:t>backup ตัวแรกของ warehouse ขนาด 59 GB ที่เดิมไม่เคยมี backup เลย</w:t>
-      </w:r>
-      <w:r>
-        <w:rPr>
-          <w:rFonts w:ascii="Tahoma" w:hAnsi="Tahoma" w:cs="Tahoma"/>
-          <w:b w:val="0"/>
-          <w:color w:val="1A1A1A"/>
-        </w:rPr>
-        <w:t xml:space="preserve"> — nightly pg_dump stream ขึ้น Azure Blob พร้อม verification task แยกและ retention 35 วัน; และย้ายเส้นทางไฟล์ของ bronze จาก OneDrive ไปเป็น </w:t>
-      </w:r>
-      <w:r>
-        <w:rPr>
-          <w:rFonts w:ascii="Tahoma" w:hAnsi="Tahoma" w:cs="Tahoma"/>
-          <w:b/>
-          <w:color w:val="1A1A1A"/>
-        </w:rPr>
-        <w:t>Azure Blob data lake</w:t>
-      </w:r>
-      <w:r>
-        <w:rPr>
-          <w:rFonts w:ascii="Tahoma" w:hAnsi="Tahoma" w:cs="Tahoma"/>
-          <w:b w:val="0"/>
-          <w:color w:val="1A1A1A"/>
-        </w:rPr>
-        <w:t xml:space="preserve"> ตัดรากของ ingestion failure ทั้งคลาส</w:t>
+        <w:t xml:space="preserve"> · เทคนิค: freshness canary เทียบ source สด, value-presence gate เป็น hard failure, regression test กันกลับมาโดยไม่มีใครรู้</w:t>
       </w:r>
     </w:p>
     <w:p>
@@ -660,7 +432,7 @@
           <w:b/>
           <w:color w:val="1A1A1A"/>
         </w:rPr>
-        <w:t>แทนที่ vendor WMS ด้วย custom apps</w:t>
+        <w:t>ลด cloud cost รายเดือน และทำ disaster-recovery backup ตัวแรกของ warehouse 59 GB</w:t>
       </w:r>
       <w:r>
         <w:rPr>
@@ -668,7 +440,45 @@
           <w:b w:val="0"/>
           <w:color w:val="1A1A1A"/>
         </w:rPr>
-        <w:t xml:space="preserve"> (WMS, barcode scanner, invoice OCR) ที่ป้อนข้อมูลเข้า warehouse — พนักงานคลัง (รวมที่ไม่ใช้ภาษาไทย) เรียนรู้ได้ใน 5 นาที รองรับ </w:t>
+        <w:t xml:space="preserve"> — ปิด platform migration 2 ตัวจบในไตรมาสเดียว (Azure SQL Server → self-hosted PostgreSQL และปลดระวาง Azure Data Factory ทั้ง 46 pipelines → Airflow DAGs) โดย dashboard ไม่ดาวน์เลย · backup: nightly pg_dump ขึ้น Azure Blob พร้อม verification task แยก retention 35 วัน</w:t>
+      </w:r>
+    </w:p>
+    <w:p>
+      <w:pPr>
+        <w:pStyle w:val="ListBullet"/>
+        <w:spacing w:after="60" w:line="269" w:lineRule="auto"/>
+      </w:pPr>
+      <w:r>
+        <w:rPr>
+          <w:rFonts w:ascii="Tahoma" w:hAnsi="Tahoma" w:cs="Tahoma"/>
+          <w:b/>
+          <w:color w:val="1A1A1A"/>
+        </w:rPr>
+        <w:t>แทนที่ vendor WMS ด้วย custom apps ที่เขียนเอง</w:t>
+      </w:r>
+      <w:r>
+        <w:rPr>
+          <w:rFonts w:ascii="Tahoma" w:hAnsi="Tahoma" w:cs="Tahoma"/>
+          <w:b w:val="0"/>
+          <w:color w:val="1A1A1A"/>
+        </w:rPr>
+        <w:t xml:space="preserve"> (WMS, barcode scanner, invoice OCR) — จากโค้ดบรรทัดแรกถึงหน้างานจริงใน </w:t>
+      </w:r>
+      <w:r>
+        <w:rPr>
+          <w:rFonts w:ascii="Tahoma" w:hAnsi="Tahoma" w:cs="Tahoma"/>
+          <w:b/>
+          <w:color w:val="1A1A1A"/>
+        </w:rPr>
+        <w:t>15 วัน</w:t>
+      </w:r>
+      <w:r>
+        <w:rPr>
+          <w:rFonts w:ascii="Tahoma" w:hAnsi="Tahoma" w:cs="Tahoma"/>
+          <w:b w:val="0"/>
+          <w:color w:val="1A1A1A"/>
+        </w:rPr>
+        <w:t xml:space="preserve"> พนักงานคลัง (รวมที่ไม่ใช้ภาษาไทย) เรียนรู้ใน 5 นาที รองรับ </w:t>
       </w:r>
       <w:r>
         <w:rPr>
@@ -684,7 +494,7 @@
           <w:b w:val="0"/>
           <w:color w:val="1A1A1A"/>
         </w:rPr>
-        <w:t xml:space="preserve"> พร้อม audit trail เต็มรูปแบบ; </w:t>
+        <w:t xml:space="preserve"> พร้อม audit trail เต็มรูปแบบ · </w:t>
       </w:r>
       <w:r>
         <w:rPr>
@@ -700,7 +510,7 @@
           <w:b w:val="0"/>
           <w:color w:val="1A1A1A"/>
         </w:rPr>
-        <w:t xml:space="preserve"> ตั้งแต่ architecture, build, deploy ไปจนถึง on-call</w:t>
+        <w:t xml:space="preserve"> ตั้งแต่ architecture, build, deploy ถึง on-call (FastAPI, React, PostgreSQL)</w:t>
       </w:r>
     </w:p>
     <w:p>
@@ -748,18 +558,10 @@
       <w:r>
         <w:rPr>
           <w:rFonts w:ascii="Tahoma" w:hAnsi="Tahoma" w:cs="Tahoma"/>
-          <w:b w:val="0"/>
-          <w:color w:val="1A1A1A"/>
-        </w:rPr>
-        <w:t xml:space="preserve">วาง </w:t>
-      </w:r>
-      <w:r>
-        <w:rPr>
-          <w:rFonts w:ascii="Tahoma" w:hAnsi="Tahoma" w:cs="Tahoma"/>
           <w:b/>
           <w:color w:val="1A1A1A"/>
         </w:rPr>
-        <w:t>Ecount ERP master data ตั้งแต่ศูนย์</w:t>
+        <w:t>จบปัญหาสต็อกไม่ตรงกันข้ามช่องทางขาย</w:t>
       </w:r>
       <w:r>
         <w:rPr>
@@ -767,7 +569,7 @@
           <w:b w:val="0"/>
           <w:color w:val="1A1A1A"/>
         </w:rPr>
-        <w:t xml:space="preserve"> — กำหนด chart of accounts, customer/vendor master และมาตรฐาน SKU mapping ข้าม marketplaces + ERP ให้เป็น single source of truth ของ catalog ปิดปัญหา SKU mapping กำกวมที่ทำให้สต็อกไม่ตรงกันข้ามช่องทาง</w:t>
+        <w:t xml:space="preserve"> — วาง master data ของ ERP ตั้งแต่ศูนย์: ผังบัญชี, ข้อมูลลูกค้า/ผู้ขาย และมาตรฐาน SKU เดียวกันทุก marketplace ให้ finance กับ sales ใช้ตัวเลขชุดเดียวกัน (Ecount ERP) · เทคนิค: chart of accounts, customer/vendor master, SKU mapping ข้าม marketplaces + ERP</w:t>
       </w:r>
     </w:p>
     <w:p>
@@ -778,18 +580,10 @@
       <w:r>
         <w:rPr>
           <w:rFonts w:ascii="Tahoma" w:hAnsi="Tahoma" w:cs="Tahoma"/>
-          <w:b w:val="0"/>
-          <w:color w:val="1A1A1A"/>
-        </w:rPr>
-        <w:t xml:space="preserve">สร้าง </w:t>
-      </w:r>
-      <w:r>
-        <w:rPr>
-          <w:rFonts w:ascii="Tahoma" w:hAnsi="Tahoma" w:cs="Tahoma"/>
           <w:b/>
           <w:color w:val="1A1A1A"/>
         </w:rPr>
-        <w:t>Power BI reports</w:t>
+        <w:t>ปิดปัญหาตัวเลข sales กับ finance ไม่ตรงกันที่เกิดซ้ำทุกเดือน</w:t>
       </w:r>
       <w:r>
         <w:rPr>
@@ -797,23 +591,7 @@
           <w:b w:val="0"/>
           <w:color w:val="1A1A1A"/>
         </w:rPr>
-        <w:t xml:space="preserve"> และใช้ </w:t>
-      </w:r>
-      <w:r>
-        <w:rPr>
-          <w:rFonts w:ascii="Tahoma" w:hAnsi="Tahoma" w:cs="Tahoma"/>
-          <w:b/>
-          <w:color w:val="1A1A1A"/>
-        </w:rPr>
-        <w:t>Power Query</w:t>
-      </w:r>
-      <w:r>
-        <w:rPr>
-          <w:rFonts w:ascii="Tahoma" w:hAnsi="Tahoma" w:cs="Tahoma"/>
-          <w:b w:val="0"/>
-          <w:color w:val="1A1A1A"/>
-        </w:rPr>
-        <w:t xml:space="preserve"> reconcile ข้อมูล ERP ระหว่างทีม sales และ finance — สร้าง monthly reporting ที่สม่ำเสมอ ปิด recurring discrepancy ที่เกิดซ้ำ</w:t>
+        <w:t xml:space="preserve"> — สร้างรายงานรายเดือนกลางที่สองทีมใช้กระทบยอดร่วมกัน (Power BI, Power Query)</w:t>
       </w:r>
     </w:p>
     <w:p>
@@ -870,7 +648,7 @@
           <w:b w:val="0"/>
           <w:color w:val="1A1A1A"/>
         </w:rPr>
-        <w:t>Data platform เต็มระบบ — ดึง raw data จาก 8 source systems (marketplaces, OMS, internal apps, logistics) ผ่าน Python + Playwright และ direct database pull ลงใน Azure Blob data lake แล้วเข้า warehouse แบบ medallion 5 ชั้น บน PostgreSQL orchestrate ด้วย Apache Airflow ใน Docker แล้วเสิร์ฟผ่าน FastAPI + React dashboard (real-time KPIs, price alerts, procurement, drilldowns) แทนการที่เคยมีคนต้องนั่งโหลดและ refresh ไฟล์ด้วยมือทุกเช้า</w:t>
+        <w:t>Data platform เต็มระบบ สร้างและดูแลคนเดียว — เปลี่ยนงานที่เคยต้องมีคนนั่งโหลดและ refresh ไฟล์ทุกเช้า ให้ระบบดึง raw data จาก 8 source systems (marketplaces, OMS, internal apps, logistics) เองอัตโนมัติ แล้วเสิร์ฟเป็น dashboard แบบ real-time ให้ทั้งบริษัท (Python + Playwright → Azure Blob data lake → dbt medallion 5 ชั้นบน PostgreSQL → Apache Airflow ใน Docker → FastAPI + React)</w:t>
       </w:r>
     </w:p>
     <w:p>

</xml_diff>

<commit_message>
Restate the migration against seven months of the real bill
The manual Cost Management exports (Feb-Aug, matched to month by total,
exact to the cent) give what the API would not: per-resource history.

The warehouse database in the cloud went 82.74 -> 216.97 USD/month from
February to June — 162% in five months, outgrowing the business — and
had become the largest single line on the subscription. That is the
number that justifies the migration, and it is now zero: the database was
deleted on 10 August. Data Factory is likewise zero from the day after
retirement.

Worth recording for later: a dashboard mart was created to serve what the
warehouse used to, and now runs about 143 USD/month — 84% of the
remaining SQL spend, and untouched by this migration. Net SQL spend is
therefore down roughly a quarter, not the amount the deleted line alone
would suggest, which is why the résumé claims the line that went to zero
and the runtime win rather than a total-savings percentage.
</commit_message>
<xml_diff>
--- a/cv-sahatsawat-thongma.docx
+++ b/cv-sahatsawat-thongma.docx
@@ -675,7 +675,7 @@
           <w:b w:val="0"/>
           <w:color w:val="1A1A1A"/>
         </w:rPr>
-        <w:t xml:space="preserve"> — ปิด platform migration 2 ตัวจบในไตรมาสเดียว (Azure SQL Server → self-hosted PostgreSQL และปลดระวาง Azure Data Factory ทั้ง 46 pipelines → Airflow DAGs) โดย dashboard ไม่ดาวน์เลย · ตรวจกับบิล Azure จริง: </w:t>
+        <w:t xml:space="preserve"> — ปิด platform migration 2 ตัวจบในไตรมาสเดียว (Azure SQL Server → self-hosted PostgreSQL และปลดระวาง Azure Data Factory ทั้ง 46 pipelines → Airflow DAGs) โดย dashboard ไม่ดาวน์เลย · ตรวจย้อนกับบิล Azure รายเดือนจริง 7 เดือน: ค่าฐานข้อมูลคลังบนคลาวด์ </w:t>
       </w:r>
       <w:r>
         <w:rPr>
@@ -683,7 +683,23 @@
           <w:b/>
           <w:color w:val="1A1A1A"/>
         </w:rPr>
-        <w:t>ค่า Data Factory เหลือ 0 ตั้งแต่วันถัดจากวันปลดระวาง</w:t>
+        <w:t>โตขึ้น 162% ใน 5 เดือน</w:t>
+      </w:r>
+      <w:r>
+        <w:rPr>
+          <w:rFonts w:ascii="Tahoma" w:hAnsi="Tahoma" w:cs="Tahoma"/>
+          <w:b w:val="0"/>
+          <w:color w:val="1A1A1A"/>
+        </w:rPr>
+        <w:t xml:space="preserve"> (โตเร็วกว่าตัวธุรกิจ) จนกลายเป็นรายจ่ายก้อนใหญ่ที่สุด — หลังย้ายเสร็จ </w:t>
+      </w:r>
+      <w:r>
+        <w:rPr>
+          <w:rFonts w:ascii="Tahoma" w:hAnsi="Tahoma" w:cs="Tahoma"/>
+          <w:b/>
+          <w:color w:val="1A1A1A"/>
+        </w:rPr>
+        <w:t>ปิดฐานข้อมูลนั้นถาวรเหลือ 0</w:t>
       </w:r>
       <w:r>
         <w:rPr>
@@ -699,7 +715,7 @@
           <w:b/>
           <w:color w:val="1A1A1A"/>
         </w:rPr>
-        <w:t>ฐานข้อมูลคลาวด์ของคลังถูกปิดถาวรได้สำเร็จ</w:t>
+        <w:t>ค่า Data Factory เหลือ 0 ตั้งแต่วันถัดจากวันปลดระวาง</w:t>
       </w:r>
       <w:r>
         <w:rPr>

</xml_diff>

<commit_message>
Refactor resume content and metrics for clarity and accuracy; update experience details, project statistics, and formatting across HTML and PDF versions.
</commit_message>
<xml_diff>
--- a/cv-sahatsawat-thongma.docx
+++ b/cv-sahatsawat-thongma.docx
@@ -100,7 +100,7 @@
           <w:b w:val="0"/>
           <w:color w:val="1A1A1A"/>
         </w:rPr>
-        <w:t>Data Engineer ประสบการณ์ 4 ปีในสาย e-commerce — ออกแบบ สร้าง และดูแล data platform เต็มระบบแบบ end-to-end ให้บริษัทที่ขายผ่าน 4 marketplace ราว 2,000 ออเดอร์/วัน รวมถึง web app และ AI system ที่ทีมใช้งานจริงทุกวัน งานมือ ~40 งาน/วันเปลี่ยนเป็นระบบอัตโนมัติที่รันเองตั้งแต่ตีห้า และผู้บริหารดูยอดขาย/สต็อกได้เองโดยไม่ต้องรอรายงาน</w:t>
+        <w:t>Data Engineer ประสบการณ์ 4 ปีในธุรกิจ e-commerce — 3 ปีฝั่งธุรกิจ (บัญชี · ERP · BI) และเป็น data engineer เต็มตัวตั้งแต่ พ.ค. 2025 — ออกแบบ สร้าง และดูแล data platform เต็มระบบแบบ end-to-end ให้บริษัทที่ขายผ่าน 4 marketplace ราว 2,000 ออเดอร์/วัน รวมถึง web app และ AI system ที่ทีมใช้งานจริงทุกวัน งานมือ ~40 งาน/วันเปลี่ยนเป็นระบบอัตโนมัติที่รันเองตั้งแต่ตีห้า และผู้บริหารดูยอดขาย/สต็อกได้เองโดยไม่ต้องรอรายงาน</w:t>
       </w:r>
     </w:p>
     <w:p>
@@ -114,7 +114,7 @@
           <w:b w:val="0"/>
           <w:color w:val="1A1A1A"/>
         </w:rPr>
-        <w:t>เทคโนโลยีที่ใช้จริงใน production: PostgreSQL data warehouse 52 GB (70 ล้านแถว, 8 source systems), dbt (199 models / 494 tests), Apache Airflow ใน Docker, Python, ELT pipelines, medallion + dimensional (Kimball) modeling, FastAPI/React และ Azure ปี 2026 ปิด platform migration 2 ตัวจบในไตรมาสเดียว (Azure SQL Server → PostgreSQL on-prem, Azure Data Factory → Airflow)</w:t>
+        <w:t>เทคโนโลยีที่ใช้จริงใน production: PostgreSQL data warehouse 50+ GB (65+ ล้านแถว, 8 source systems), dbt (200+ models / 500+ tests), Apache Airflow ใน Docker, Python, ELT pipelines, medallion + dimensional (Kimball) modeling, FastAPI/React และ Azure ปี 2026 ปิด platform migration 2 ตัวจบในไตรมาสเดียว (Azure SQL Server → PostgreSQL on-prem, Azure Data Factory → Airflow)</w:t>
       </w:r>
     </w:p>
     <w:p>
@@ -397,7 +397,7 @@
           <w:b/>
           <w:color w:val="1A1A1A"/>
         </w:rPr>
-        <w:t>94.6% บน 323,134 ออเดอร์</w:t>
+        <w:t>~95% บน 320,000+ ออเดอร์</w:t>
       </w:r>
       <w:r>
         <w:rPr>
@@ -451,7 +451,7 @@
           <w:b/>
           <w:color w:val="1A1A1A"/>
         </w:rPr>
-        <w:t>23,677 เลข</w:t>
+        <w:t>23,600+ เลข</w:t>
       </w:r>
       <w:r>
         <w:rPr>
@@ -505,7 +505,7 @@
           <w:b/>
           <w:color w:val="1A1A1A"/>
         </w:rPr>
-        <w:t>150 คู่ SKU×ร้าน / 970 จุด</w:t>
+        <w:t>150 คู่ SKU×ร้าน / 950+ จุด</w:t>
       </w:r>
       <w:r>
         <w:rPr>
@@ -521,7 +521,7 @@
           <w:b/>
           <w:color w:val="1A1A1A"/>
         </w:rPr>
-        <w:t>เฉลี่ย 9.9 จุด% (หนักสุดเกิน 180 จุด%) คิดเป็นเงินรั่ว 9.3% ของมูลค่าสินค้าในกลุ่มนั้น</w:t>
+        <w:t>เฉลี่ย 9.9 จุด% (หนักสุดเกิน 160 จุด%) คิดเป็นเงินรั่ว 9.3% ของมูลค่าสินค้าในกลุ่มนั้น</w:t>
       </w:r>
       <w:r>
         <w:rPr>
@@ -537,7 +537,7 @@
           <w:b/>
           <w:color w:val="1A1A1A"/>
         </w:rPr>
-        <w:t>2,971 SKU ชี้ 373 ตัวที่ต้องสั่งทันที</w:t>
+        <w:t>2,900+ SKU ชี้ 360+ ตัวที่ต้องสั่งทันที</w:t>
       </w:r>
       <w:r>
         <w:rPr>
@@ -591,7 +591,7 @@
           <w:b/>
           <w:color w:val="1A1A1A"/>
         </w:rPr>
-        <w:t>208,189 รายการ · ผู้ใช้จริง 36 คน</w:t>
+        <w:t>200,000+ รายการ · ผู้ใช้จริง 36 คน</w:t>
       </w:r>
       <w:r>
         <w:rPr>
@@ -607,7 +607,7 @@
           <w:b/>
           <w:color w:val="1A1A1A"/>
         </w:rPr>
-        <w:t>“เคลม” ออกจาก “คืนปกติ” ได้ 21,152 พัสดุ</w:t>
+        <w:t>“เคลม” ออกจาก “คืนปกติ” ได้ 21,000+ พัสดุ</w:t>
       </w:r>
       <w:r>
         <w:rPr>
@@ -615,7 +615,7 @@
           <w:b w:val="0"/>
           <w:color w:val="1A1A1A"/>
         </w:rPr>
-        <w:t xml:space="preserve"> และตอบได้ว่าของกลับถึงคลังหรือยัง (มองเห็นขากลับจาก 26.8% เป็น 98.0% ผ่าน crosswalk เลขขาไป↔ขากลับ 28,891 คู่) — เห็นของที่กำลังเดินทางกลับอีก </w:t>
+        <w:t xml:space="preserve"> และตอบได้ว่าของกลับถึงคลังหรือยัง (มองเห็นขากลับจาก 26.8% เป็น 98.0% ผ่าน crosswalk เลขขาไป↔ขากลับ 28,000+ คู่) — เห็นของที่กำลังเดินทางกลับอีก </w:t>
       </w:r>
       <w:r>
         <w:rPr>
@@ -747,7 +747,7 @@
           <w:b/>
           <w:color w:val="1A1A1A"/>
         </w:rPr>
-        <w:t>ดูแลระบบ production ทั้ง 7 ตัว</w:t>
+        <w:t>ดูแลระบบ production ทั้ง 9 ตัว</w:t>
       </w:r>
       <w:r>
         <w:rPr>
@@ -880,7 +880,7 @@
           <w:color w:val="555555"/>
           <w:sz w:val="19"/>
         </w:rPr>
-        <w:t>52 GB PostgreSQL warehouse · 70M rows · 8 source systems · 199 dbt models · 494 data tests · 11 Airflow DAGs · 32 file types · ~2,000 orders/day</w:t>
+        <w:t>50+ GB PostgreSQL warehouse · 65M+ rows · 8 source systems · 200+ dbt models · 500+ data tests · 11 Airflow DAGs · 32 file types · ~2,000 orders/day</w:t>
       </w:r>
     </w:p>
     <w:p>

</xml_diff>